<commit_message>
Corrected Invoice mail format(Brand mail and RM)
</commit_message>
<xml_diff>
--- a/templates/on-behalf-invoice-template.docx
+++ b/templates/on-behalf-invoice-template.docx
@@ -806,16 +806,13 @@
               </w:rPr>
               <w:t>}, KW DELHI-6</w:t>
             </w:r>
-          </w:p>
-          <w:p>
-            <w:pPr>
-              <w:contextualSpacing/>
-              <w:jc w:val="both"/>
-              <w:rPr>
-                <w:sz w:val="24"/>
-                <w:szCs w:val="24"/>
-              </w:rPr>
-            </w:pPr>
+            <w:r>
+              <w:rPr>
+                <w:sz w:val="24"/>
+                <w:szCs w:val="24"/>
+              </w:rPr>
+              <w:t xml:space="preserve">, RAJ NAGAR </w:t>
+            </w:r>
             <w:r>
               <w:rPr>
                 <w:sz w:val="24"/>
@@ -823,6 +820,8 @@
               </w:rPr>
               <w:t xml:space="preserve">EXTENSION, GHAZIABAD, UTTAR PRADESH-201017. </w:t>
             </w:r>
+            <w:bookmarkStart w:id="0" w:name="_GoBack"/>
+            <w:bookmarkEnd w:id="0"/>
           </w:p>
         </w:tc>
         <w:tc>
@@ -915,8 +914,6 @@
                 <w:szCs w:val="24"/>
               </w:rPr>
             </w:pPr>
-            <w:bookmarkStart w:id="0" w:name="_GoBack"/>
-            <w:bookmarkEnd w:id="0"/>
             <w:r>
               <w:rPr>
                 <w:color w:val="FF0000"/>

</xml_diff>